<commit_message>
Assignment 4 Prompt Engineering done
</commit_message>
<xml_diff>
--- a/Assignment 4.docx
+++ b/Assignment 4.docx
@@ -88,48 +88,96 @@
     <w:p>
       <w:pPr>
         <w:spacing w:after="0"/>
+      </w:pPr>
+      <w:r>
         <w:rPr>
           <w:rFonts w:ascii="Calibri" w:hAnsi="Calibri" w:cs="Calibri"/>
-          <w:sz w:val="24"/>
-          <w:szCs w:val="24"/>
-        </w:rPr>
-      </w:pPr>
-      <w:r>
+          <w:b/>
+          <w:sz w:val="24"/>
+          <w:szCs w:val="24"/>
+        </w:rPr>
+        <w:t xml:space="preserve">Prompt: </w:t>
+      </w:r>
+      <w:r>
+        <w:rPr>
+          <w:highlight w:val="yellow"/>
+        </w:rPr>
+        <w:t>Classify the following customer review as either 'Positive' or 'Negative':</w:t>
+      </w:r>
+      <w:r>
+        <w:t xml:space="preserve"> </w:t>
+      </w:r>
+    </w:p>
+    <w:p>
+      <w:pPr>
+        <w:spacing w:after="0"/>
+        <w:ind w:firstLine="720"/>
         <w:rPr>
           <w:rFonts w:ascii="Calibri" w:hAnsi="Calibri" w:cs="Calibri"/>
-          <w:b/>
-          <w:sz w:val="24"/>
-          <w:szCs w:val="24"/>
-        </w:rPr>
-        <w:t xml:space="preserve">Prompt: </w:t>
-      </w:r>
-      <w:r>
+          <w:sz w:val="24"/>
+          <w:szCs w:val="24"/>
+        </w:rPr>
+      </w:pPr>
+      <w:r>
+        <w:t>'The food arrived cold and the waiter was quite rude, though the dessert was okay.</w:t>
+      </w:r>
+    </w:p>
+    <w:p>
+      <w:pPr>
+        <w:spacing w:after="0"/>
         <w:rPr>
           <w:rFonts w:ascii="Calibri" w:hAnsi="Calibri" w:cs="Calibri"/>
           <w:sz w:val="24"/>
           <w:szCs w:val="24"/>
-          <w:highlight w:val="yellow"/>
-        </w:rPr>
-        <w:t xml:space="preserve">Summarize the following story in a concise paragraph or determine whether the given </w:t>
-      </w:r>
-      <w:r>
+        </w:rPr>
+      </w:pPr>
+    </w:p>
+    <w:p>
+      <w:pPr>
+        <w:spacing w:after="0"/>
         <w:rPr>
           <w:rFonts w:ascii="Calibri" w:hAnsi="Calibri" w:cs="Calibri"/>
           <w:sz w:val="24"/>
           <w:szCs w:val="24"/>
-          <w:highlight w:val="yellow"/>
-        </w:rPr>
-        <w:t xml:space="preserve">  </w:t>
-      </w:r>
+          <w:u w:val="single"/>
+        </w:rPr>
+      </w:pPr>
       <w:r>
         <w:rPr>
           <w:rFonts w:ascii="Calibri" w:hAnsi="Calibri" w:cs="Calibri"/>
-          <w:sz w:val="24"/>
-          <w:szCs w:val="24"/>
-          <w:highlight w:val="yellow"/>
-        </w:rPr>
-        <w:t>review is positive or negative.</w:t>
-      </w:r>
+          <w:b/>
+          <w:sz w:val="24"/>
+          <w:szCs w:val="24"/>
+        </w:rPr>
+        <w:t>Response:</w:t>
+      </w:r>
+      <w:r>
+        <w:rPr>
+          <w:rFonts w:ascii="Calibri" w:hAnsi="Calibri" w:cs="Calibri"/>
+          <w:sz w:val="24"/>
+          <w:szCs w:val="24"/>
+        </w:rPr>
+        <w:t xml:space="preserve"> </w:t>
+      </w:r>
+      <w:r>
+        <w:rPr>
+          <w:rFonts w:ascii="Calibri" w:hAnsi="Calibri" w:cs="Calibri"/>
+          <w:sz w:val="24"/>
+          <w:szCs w:val="24"/>
+          <w:u w:val="single"/>
+        </w:rPr>
+        <w:t>Negative</w:t>
+      </w:r>
+    </w:p>
+    <w:p>
+      <w:pPr>
+        <w:spacing w:after="0"/>
+        <w:rPr>
+          <w:rFonts w:ascii="Calibri" w:hAnsi="Calibri" w:cs="Calibri"/>
+          <w:sz w:val="24"/>
+          <w:szCs w:val="24"/>
+        </w:rPr>
+      </w:pPr>
     </w:p>
     <w:p>
       <w:pPr>
@@ -141,73 +189,6 @@
           <w:szCs w:val="24"/>
         </w:rPr>
       </w:pPr>
-      <w:r>
-        <w:rPr>
-          <w:rFonts w:ascii="Calibri" w:hAnsi="Calibri" w:cs="Calibri"/>
-          <w:b/>
-          <w:noProof/>
-          <w:sz w:val="24"/>
-          <w:szCs w:val="24"/>
-        </w:rPr>
-        <mc:AlternateContent>
-          <mc:Choice Requires="wps">
-            <w:drawing>
-              <wp:anchor distT="0" distB="0" distL="114300" distR="114300" simplePos="0" relativeHeight="251659264" behindDoc="0" locked="0" layoutInCell="1" allowOverlap="1">
-                <wp:simplePos x="0" y="0"/>
-                <wp:positionH relativeFrom="column">
-                  <wp:posOffset>-466725</wp:posOffset>
-                </wp:positionH>
-                <wp:positionV relativeFrom="paragraph">
-                  <wp:posOffset>58420</wp:posOffset>
-                </wp:positionV>
-                <wp:extent cx="6848475" cy="38100"/>
-                <wp:effectExtent l="0" t="0" r="28575" b="19050"/>
-                <wp:wrapNone/>
-                <wp:docPr id="1" name="Straight Connector 1"/>
-                <wp:cNvGraphicFramePr/>
-                <a:graphic xmlns:a="http://schemas.openxmlformats.org/drawingml/2006/main">
-                  <a:graphicData uri="http://schemas.microsoft.com/office/word/2010/wordprocessingShape">
-                    <wps:wsp>
-                      <wps:cNvCnPr/>
-                      <wps:spPr>
-                        <a:xfrm flipV="1">
-                          <a:off x="0" y="0"/>
-                          <a:ext cx="6848475" cy="38100"/>
-                        </a:xfrm>
-                        <a:prstGeom prst="line">
-                          <a:avLst/>
-                        </a:prstGeom>
-                      </wps:spPr>
-                      <wps:style>
-                        <a:lnRef idx="1">
-                          <a:schemeClr val="dk1"/>
-                        </a:lnRef>
-                        <a:fillRef idx="0">
-                          <a:schemeClr val="dk1"/>
-                        </a:fillRef>
-                        <a:effectRef idx="0">
-                          <a:schemeClr val="dk1"/>
-                        </a:effectRef>
-                        <a:fontRef idx="minor">
-                          <a:schemeClr val="tx1"/>
-                        </a:fontRef>
-                      </wps:style>
-                      <wps:bodyPr/>
-                    </wps:wsp>
-                  </a:graphicData>
-                </a:graphic>
-              </wp:anchor>
-            </w:drawing>
-          </mc:Choice>
-          <mc:Fallback>
-            <w:pict>
-              <v:line w14:anchorId="1EA39F2B" id="Straight Connector 1" o:spid="_x0000_s1026" style="position:absolute;flip:y;z-index:251659264;visibility:visible;mso-wrap-style:square;mso-wrap-distance-left:9pt;mso-wrap-distance-top:0;mso-wrap-distance-right:9pt;mso-wrap-distance-bottom:0;mso-position-horizontal:absolute;mso-position-horizontal-relative:text;mso-position-vertical:absolute;mso-position-vertical-relative:text" from="-36.75pt,4.6pt" to="502.5pt,7.6pt" o:gfxdata="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" strokecolor="black [3200]" strokeweight=".5pt">
-                <v:stroke joinstyle="miter"/>
-              </v:line>
-            </w:pict>
-          </mc:Fallback>
-        </mc:AlternateContent>
-      </w:r>
     </w:p>
     <w:p>
       <w:pPr>
@@ -308,81 +289,22 @@
           <w:rFonts w:asciiTheme="minorHAnsi" w:hAnsiTheme="minorHAnsi" w:cstheme="minorHAnsi"/>
         </w:rPr>
         <w:br/>
-        <w:t>John Doe → Doe, John</w:t>
-      </w:r>
-    </w:p>
-    <w:p>
-      <w:pPr>
-        <w:pStyle w:val="NormalWeb"/>
-        <w:rPr>
-          <w:rFonts w:asciiTheme="minorHAnsi" w:hAnsiTheme="minorHAnsi" w:cstheme="minorHAnsi"/>
-        </w:rPr>
-      </w:pPr>
-      <w:r>
-        <w:rPr>
-          <w:rFonts w:ascii="Calibri" w:hAnsi="Calibri" w:cs="Calibri"/>
-          <w:b/>
-          <w:noProof/>
-        </w:rPr>
-        <mc:AlternateContent>
-          <mc:Choice Requires="wps">
-            <w:drawing>
-              <wp:anchor distT="0" distB="0" distL="114300" distR="114300" simplePos="0" relativeHeight="251661312" behindDoc="0" locked="0" layoutInCell="1" allowOverlap="1" wp14:anchorId="4FC01018" wp14:editId="16365165">
-                <wp:simplePos x="0" y="0"/>
-                <wp:positionH relativeFrom="column">
-                  <wp:posOffset>-466725</wp:posOffset>
-                </wp:positionH>
-                <wp:positionV relativeFrom="paragraph">
-                  <wp:posOffset>434975</wp:posOffset>
-                </wp:positionV>
-                <wp:extent cx="6848475" cy="38100"/>
-                <wp:effectExtent l="0" t="0" r="28575" b="19050"/>
-                <wp:wrapNone/>
-                <wp:docPr id="2" name="Straight Connector 2"/>
-                <wp:cNvGraphicFramePr/>
-                <a:graphic xmlns:a="http://schemas.openxmlformats.org/drawingml/2006/main">
-                  <a:graphicData uri="http://schemas.microsoft.com/office/word/2010/wordprocessingShape">
-                    <wps:wsp>
-                      <wps:cNvCnPr/>
-                      <wps:spPr>
-                        <a:xfrm flipV="1">
-                          <a:off x="0" y="0"/>
-                          <a:ext cx="6848475" cy="38100"/>
-                        </a:xfrm>
-                        <a:prstGeom prst="line">
-                          <a:avLst/>
-                        </a:prstGeom>
-                      </wps:spPr>
-                      <wps:style>
-                        <a:lnRef idx="1">
-                          <a:schemeClr val="dk1"/>
-                        </a:lnRef>
-                        <a:fillRef idx="0">
-                          <a:schemeClr val="dk1"/>
-                        </a:fillRef>
-                        <a:effectRef idx="0">
-                          <a:schemeClr val="dk1"/>
-                        </a:effectRef>
-                        <a:fontRef idx="minor">
-                          <a:schemeClr val="tx1"/>
-                        </a:fontRef>
-                      </wps:style>
-                      <wps:bodyPr/>
-                    </wps:wsp>
-                  </a:graphicData>
-                </a:graphic>
-              </wp:anchor>
-            </w:drawing>
-          </mc:Choice>
-          <mc:Fallback>
-            <w:pict>
-              <v:line w14:anchorId="75D3B38D" id="Straight Connector 2" o:spid="_x0000_s1026" style="position:absolute;flip:y;z-index:251661312;visibility:visible;mso-wrap-style:square;mso-wrap-distance-left:9pt;mso-wrap-distance-top:0;mso-wrap-distance-right:9pt;mso-wrap-distance-bottom:0;mso-position-horizontal:absolute;mso-position-horizontal-relative:text;mso-position-vertical:absolute;mso-position-vertical-relative:text" from="-36.75pt,34.25pt" to="502.5pt,37.25pt" o:gfxdata="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" strokecolor="black [3200]" strokeweight=".5pt">
-                <v:stroke joinstyle="miter"/>
-              </v:line>
-            </w:pict>
-          </mc:Fallback>
-        </mc:AlternateContent>
-      </w:r>
+        <w:t>John Doe to</w:t>
+      </w:r>
+      <w:r>
+        <w:rPr>
+          <w:rFonts w:asciiTheme="minorHAnsi" w:hAnsiTheme="minorHAnsi" w:cstheme="minorHAnsi"/>
+        </w:rPr>
+        <w:t xml:space="preserve"> Doe, John</w:t>
+      </w:r>
+    </w:p>
+    <w:p>
+      <w:pPr>
+        <w:pStyle w:val="NormalWeb"/>
+        <w:rPr>
+          <w:rFonts w:asciiTheme="minorHAnsi" w:hAnsiTheme="minorHAnsi" w:cstheme="minorHAnsi"/>
+        </w:rPr>
+      </w:pPr>
       <w:r>
         <w:rPr>
           <w:rFonts w:asciiTheme="minorHAnsi" w:hAnsiTheme="minorHAnsi" w:cstheme="minorHAnsi"/>
@@ -409,6 +331,43 @@
         </w:rPr>
         <w:t>Shoaib Ahmed</w:t>
       </w:r>
+    </w:p>
+    <w:p>
+      <w:pPr>
+        <w:pStyle w:val="NormalWeb"/>
+        <w:rPr>
+          <w:rFonts w:asciiTheme="minorHAnsi" w:hAnsiTheme="minorHAnsi" w:cstheme="minorHAnsi"/>
+          <w:u w:val="single"/>
+        </w:rPr>
+      </w:pPr>
+      <w:r>
+        <w:rPr>
+          <w:rFonts w:asciiTheme="minorHAnsi" w:hAnsiTheme="minorHAnsi" w:cstheme="minorHAnsi"/>
+          <w:b/>
+        </w:rPr>
+        <w:t>Response:</w:t>
+      </w:r>
+      <w:r>
+        <w:rPr>
+          <w:rFonts w:asciiTheme="minorHAnsi" w:hAnsiTheme="minorHAnsi" w:cstheme="minorHAnsi"/>
+        </w:rPr>
+        <w:t xml:space="preserve"> </w:t>
+      </w:r>
+      <w:r>
+        <w:rPr>
+          <w:rFonts w:asciiTheme="minorHAnsi" w:hAnsiTheme="minorHAnsi" w:cstheme="minorHAnsi"/>
+          <w:u w:val="single"/>
+        </w:rPr>
+        <w:t>Ahmed, Shoaib</w:t>
+      </w:r>
+    </w:p>
+    <w:p>
+      <w:pPr>
+        <w:pStyle w:val="NormalWeb"/>
+        <w:rPr>
+          <w:rFonts w:asciiTheme="minorHAnsi" w:hAnsiTheme="minorHAnsi" w:cstheme="minorHAnsi"/>
+        </w:rPr>
+      </w:pPr>
     </w:p>
     <w:p>
       <w:pPr>
@@ -544,6 +503,7 @@
           <w:sz w:val="24"/>
           <w:szCs w:val="24"/>
         </w:rPr>
+        <w:lastRenderedPageBreak/>
         <w:t>Running Shoes:</w:t>
       </w:r>
       <w:r>
@@ -560,6 +520,7 @@
         <w:pStyle w:val="NormalWeb"/>
         <w:rPr>
           <w:rFonts w:asciiTheme="minorHAnsi" w:hAnsiTheme="minorHAnsi" w:cstheme="minorHAnsi"/>
+          <w:b/>
         </w:rPr>
       </w:pPr>
       <w:r>
@@ -572,13 +533,7 @@
         <w:rPr>
           <w:rFonts w:asciiTheme="minorHAnsi" w:hAnsiTheme="minorHAnsi" w:cstheme="minorHAnsi"/>
         </w:rPr>
-        <w:t>style, write a product description for a ne</w:t>
-      </w:r>
-      <w:r>
-        <w:rPr>
-          <w:rFonts w:asciiTheme="minorHAnsi" w:hAnsiTheme="minorHAnsi" w:cstheme="minorHAnsi"/>
-        </w:rPr>
-        <w:t xml:space="preserve">w </w:t>
+        <w:t xml:space="preserve">style, write a product description for a new </w:t>
       </w:r>
       <w:r>
         <w:rPr>
@@ -604,74 +559,26 @@
       </w:pPr>
       <w:r>
         <w:rPr>
+          <w:rFonts w:asciiTheme="minorHAnsi" w:hAnsiTheme="minorHAnsi" w:cstheme="minorHAnsi"/>
+          <w:b/>
+        </w:rPr>
+        <w:t xml:space="preserve">Response: </w:t>
+      </w:r>
+      <w:r>
+        <w:rPr>
           <w:rFonts w:ascii="Calibri" w:hAnsi="Calibri" w:cs="Calibri"/>
-          <w:b/>
-          <w:noProof/>
-        </w:rPr>
-        <mc:AlternateContent>
-          <mc:Choice Requires="wps">
-            <w:drawing>
-              <wp:anchor distT="0" distB="0" distL="114300" distR="114300" simplePos="0" relativeHeight="251663360" behindDoc="0" locked="0" layoutInCell="1" allowOverlap="1" wp14:anchorId="49C8F59E" wp14:editId="3D8381CB">
-                <wp:simplePos x="0" y="0"/>
-                <wp:positionH relativeFrom="column">
-                  <wp:posOffset>-466725</wp:posOffset>
-                </wp:positionH>
-                <wp:positionV relativeFrom="paragraph">
-                  <wp:posOffset>152400</wp:posOffset>
-                </wp:positionV>
-                <wp:extent cx="6848475" cy="38100"/>
-                <wp:effectExtent l="0" t="0" r="28575" b="19050"/>
-                <wp:wrapNone/>
-                <wp:docPr id="3" name="Straight Connector 3"/>
-                <wp:cNvGraphicFramePr/>
-                <a:graphic xmlns:a="http://schemas.openxmlformats.org/drawingml/2006/main">
-                  <a:graphicData uri="http://schemas.microsoft.com/office/word/2010/wordprocessingShape">
-                    <wps:wsp>
-                      <wps:cNvCnPr/>
-                      <wps:spPr>
-                        <a:xfrm flipV="1">
-                          <a:off x="0" y="0"/>
-                          <a:ext cx="6848475" cy="38100"/>
-                        </a:xfrm>
-                        <a:prstGeom prst="line">
-                          <a:avLst/>
-                        </a:prstGeom>
-                        <a:ln>
-                          <a:solidFill>
-                            <a:schemeClr val="tx1"/>
-                          </a:solidFill>
-                        </a:ln>
-                      </wps:spPr>
-                      <wps:style>
-                        <a:lnRef idx="1">
-                          <a:schemeClr val="dk1"/>
-                        </a:lnRef>
-                        <a:fillRef idx="0">
-                          <a:schemeClr val="dk1"/>
-                        </a:fillRef>
-                        <a:effectRef idx="0">
-                          <a:schemeClr val="dk1"/>
-                        </a:effectRef>
-                        <a:fontRef idx="minor">
-                          <a:schemeClr val="tx1"/>
-                        </a:fontRef>
-                      </wps:style>
-                      <wps:bodyPr/>
-                    </wps:wsp>
-                  </a:graphicData>
-                </a:graphic>
-              </wp:anchor>
-            </w:drawing>
-          </mc:Choice>
-          <mc:Fallback>
-            <w:pict>
-              <v:line w14:anchorId="7D8663D4" id="Straight Connector 3" o:spid="_x0000_s1026" style="position:absolute;flip:y;z-index:251663360;visibility:visible;mso-wrap-style:square;mso-wrap-distance-left:9pt;mso-wrap-distance-top:0;mso-wrap-distance-right:9pt;mso-wrap-distance-bottom:0;mso-position-horizontal:absolute;mso-position-horizontal-relative:text;mso-position-vertical:absolute;mso-position-vertical-relative:text" from="-36.75pt,12pt" to="502.5pt,15pt" o:gfxdata="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" strokecolor="black [3213]" strokeweight=".5pt">
-                <v:stroke joinstyle="miter"/>
-              </v:line>
-            </w:pict>
-          </mc:Fallback>
-        </mc:AlternateContent>
-      </w:r>
+          <w:u w:val="single"/>
+        </w:rPr>
+        <w:t>Smoothies on the go. High-power blades. USB-rechargeable. Blend anywhere.</w:t>
+      </w:r>
+    </w:p>
+    <w:p>
+      <w:pPr>
+        <w:pStyle w:val="NormalWeb"/>
+        <w:rPr>
+          <w:rFonts w:asciiTheme="minorHAnsi" w:hAnsiTheme="minorHAnsi" w:cstheme="minorHAnsi"/>
+        </w:rPr>
+      </w:pPr>
     </w:p>
     <w:p>
       <w:pPr>
@@ -685,7 +592,6 @@
           <w:rStyle w:val="Strong"/>
           <w:rFonts w:asciiTheme="minorHAnsi" w:hAnsiTheme="minorHAnsi" w:cstheme="minorHAnsi"/>
         </w:rPr>
-        <w:lastRenderedPageBreak/>
         <w:t xml:space="preserve">Question 4: </w:t>
       </w:r>
       <w:r>
@@ -832,102 +738,81 @@
       </w:pPr>
       <w:r>
         <w:rPr>
+          <w:rFonts w:eastAsia="Times New Roman" w:cstheme="minorHAnsi"/>
+          <w:sz w:val="24"/>
+          <w:szCs w:val="24"/>
+        </w:rPr>
+        <w:t xml:space="preserve">Respond to this: </w:t>
+      </w:r>
+      <w:r>
+        <w:rPr>
+          <w:rFonts w:eastAsia="Times New Roman" w:cstheme="minorHAnsi"/>
+          <w:b/>
+          <w:sz w:val="24"/>
+          <w:szCs w:val="24"/>
+        </w:rPr>
+        <w:t>'I've been waiting for my</w:t>
+      </w:r>
+      <w:r>
+        <w:rPr>
+          <w:rFonts w:eastAsia="Times New Roman" w:cstheme="minorHAnsi"/>
+          <w:b/>
+          <w:sz w:val="24"/>
+          <w:szCs w:val="24"/>
+        </w:rPr>
+        <w:t xml:space="preserve"> towels for twenty minutes!</w:t>
+      </w:r>
+    </w:p>
+    <w:p>
+      <w:pPr>
+        <w:spacing w:after="0" w:line="240" w:lineRule="auto"/>
+        <w:rPr>
+          <w:rFonts w:eastAsia="Times New Roman" w:cstheme="minorHAnsi"/>
+          <w:b/>
+          <w:sz w:val="24"/>
+          <w:szCs w:val="24"/>
+        </w:rPr>
+      </w:pPr>
+    </w:p>
+    <w:p>
+      <w:pPr>
+        <w:spacing w:after="0" w:line="240" w:lineRule="auto"/>
+        <w:rPr>
+          <w:rFonts w:ascii="Calibri" w:eastAsia="Times New Roman" w:hAnsi="Calibri" w:cs="Calibri"/>
+          <w:b/>
+          <w:sz w:val="24"/>
+          <w:szCs w:val="24"/>
+        </w:rPr>
+      </w:pPr>
+      <w:r>
+        <w:rPr>
+          <w:rFonts w:ascii="Calibri" w:eastAsia="Times New Roman" w:hAnsi="Calibri" w:cs="Calibri"/>
+          <w:b/>
+          <w:sz w:val="24"/>
+          <w:szCs w:val="24"/>
+        </w:rPr>
+        <w:t xml:space="preserve">Response: </w:t>
+      </w:r>
+      <w:r>
+        <w:rPr>
           <w:rFonts w:ascii="Calibri" w:hAnsi="Calibri" w:cs="Calibri"/>
-          <w:b/>
-          <w:noProof/>
-          <w:sz w:val="24"/>
-          <w:szCs w:val="24"/>
-        </w:rPr>
-        <mc:AlternateContent>
-          <mc:Choice Requires="wps">
-            <w:drawing>
-              <wp:anchor distT="0" distB="0" distL="114300" distR="114300" simplePos="0" relativeHeight="251665408" behindDoc="0" locked="0" layoutInCell="1" allowOverlap="1" wp14:anchorId="3295D5A1" wp14:editId="39314825">
-                <wp:simplePos x="0" y="0"/>
-                <wp:positionH relativeFrom="column">
-                  <wp:posOffset>-438150</wp:posOffset>
-                </wp:positionH>
-                <wp:positionV relativeFrom="paragraph">
-                  <wp:posOffset>325120</wp:posOffset>
-                </wp:positionV>
-                <wp:extent cx="6848475" cy="38100"/>
-                <wp:effectExtent l="0" t="0" r="28575" b="19050"/>
-                <wp:wrapNone/>
-                <wp:docPr id="4" name="Straight Connector 4"/>
-                <wp:cNvGraphicFramePr/>
-                <a:graphic xmlns:a="http://schemas.openxmlformats.org/drawingml/2006/main">
-                  <a:graphicData uri="http://schemas.microsoft.com/office/word/2010/wordprocessingShape">
-                    <wps:wsp>
-                      <wps:cNvCnPr/>
-                      <wps:spPr>
-                        <a:xfrm flipV="1">
-                          <a:off x="0" y="0"/>
-                          <a:ext cx="6848475" cy="38100"/>
-                        </a:xfrm>
-                        <a:prstGeom prst="line">
-                          <a:avLst/>
-                        </a:prstGeom>
-                        <a:ln>
-                          <a:solidFill>
-                            <a:schemeClr val="tx1"/>
-                          </a:solidFill>
-                        </a:ln>
-                      </wps:spPr>
-                      <wps:style>
-                        <a:lnRef idx="1">
-                          <a:schemeClr val="dk1"/>
-                        </a:lnRef>
-                        <a:fillRef idx="0">
-                          <a:schemeClr val="dk1"/>
-                        </a:fillRef>
-                        <a:effectRef idx="0">
-                          <a:schemeClr val="dk1"/>
-                        </a:effectRef>
-                        <a:fontRef idx="minor">
-                          <a:schemeClr val="tx1"/>
-                        </a:fontRef>
-                      </wps:style>
-                      <wps:bodyPr/>
-                    </wps:wsp>
-                  </a:graphicData>
-                </a:graphic>
-              </wp:anchor>
-            </w:drawing>
-          </mc:Choice>
-          <mc:Fallback>
-            <w:pict>
-              <v:line w14:anchorId="5F5C1CD2" id="Straight Connector 4" o:spid="_x0000_s1026" style="position:absolute;flip:y;z-index:251665408;visibility:visible;mso-wrap-style:square;mso-wrap-distance-left:9pt;mso-wrap-distance-top:0;mso-wrap-distance-right:9pt;mso-wrap-distance-bottom:0;mso-position-horizontal:absolute;mso-position-horizontal-relative:text;mso-position-vertical:absolute;mso-position-vertical-relative:text" from="-34.5pt,25.6pt" to="504.75pt,28.6pt" o:gfxdata="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" strokecolor="black [3213]" strokeweight=".5pt">
-                <v:stroke joinstyle="miter"/>
-              </v:line>
-            </w:pict>
-          </mc:Fallback>
-        </mc:AlternateContent>
-      </w:r>
-      <w:r>
+          <w:sz w:val="24"/>
+          <w:szCs w:val="24"/>
+          <w:u w:val="single"/>
+        </w:rPr>
+        <w:t>Please accept my sincerest apologies for the delay and the inconvenience this has caused you. I will personally ensure that fresh towels are delivered to your room immediately, and I shall inform the floor manager of this oversight to ensure it does not happen again.</w:t>
+      </w:r>
+    </w:p>
+    <w:p>
+      <w:pPr>
+        <w:spacing w:after="0" w:line="240" w:lineRule="auto"/>
         <w:rPr>
           <w:rFonts w:eastAsia="Times New Roman" w:cstheme="minorHAnsi"/>
-          <w:sz w:val="24"/>
-          <w:szCs w:val="24"/>
-        </w:rPr>
-        <w:t xml:space="preserve">Respond to this: </w:t>
-      </w:r>
-      <w:r>
-        <w:rPr>
-          <w:rFonts w:eastAsia="Times New Roman" w:cstheme="minorHAnsi"/>
-          <w:b/>
-          <w:sz w:val="24"/>
-          <w:szCs w:val="24"/>
-        </w:rPr>
-        <w:t>'I've been waiting for my</w:t>
-      </w:r>
-      <w:r>
-        <w:rPr>
-          <w:rFonts w:eastAsia="Times New Roman" w:cstheme="minorHAnsi"/>
-          <w:b/>
-          <w:sz w:val="24"/>
-          <w:szCs w:val="24"/>
-        </w:rPr>
-        <w:t xml:space="preserve"> towels for twenty minutes!</w:t>
-      </w:r>
+          <w:b/>
+          <w:sz w:val="24"/>
+          <w:szCs w:val="24"/>
+        </w:rPr>
+      </w:pPr>
     </w:p>
     <w:p>
       <w:pPr>
@@ -1016,92 +901,73 @@
           <w:rFonts w:asciiTheme="minorHAnsi" w:hAnsiTheme="minorHAnsi" w:cstheme="minorHAnsi"/>
           <w:highlight w:val="yellow"/>
         </w:rPr>
-        <w:t>Act as a professional history teacher. Answer the following question as a historian would: What were the major causes of the French Revolution and how did they influence its outcomes?</w:t>
-      </w:r>
-    </w:p>
-    <w:p>
-      <w:pPr>
-        <w:pStyle w:val="NormalWeb"/>
-        <w:spacing w:after="0" w:afterAutospacing="0"/>
-        <w:rPr>
-          <w:rFonts w:asciiTheme="minorHAnsi" w:hAnsiTheme="minorHAnsi" w:cstheme="minorHAnsi"/>
-        </w:rPr>
-      </w:pPr>
-      <w:r>
-        <w:rPr>
-          <w:rFonts w:ascii="Calibri" w:hAnsi="Calibri" w:cs="Calibri"/>
-          <w:b/>
-          <w:noProof/>
-        </w:rPr>
-        <mc:AlternateContent>
-          <mc:Choice Requires="wps">
-            <w:drawing>
-              <wp:anchor distT="0" distB="0" distL="114300" distR="114300" simplePos="0" relativeHeight="251667456" behindDoc="0" locked="0" layoutInCell="1" allowOverlap="1" wp14:anchorId="4E100AD8" wp14:editId="587CDCA1">
-                <wp:simplePos x="0" y="0"/>
-                <wp:positionH relativeFrom="column">
-                  <wp:posOffset>-438150</wp:posOffset>
-                </wp:positionH>
-                <wp:positionV relativeFrom="paragraph">
-                  <wp:posOffset>85725</wp:posOffset>
-                </wp:positionV>
-                <wp:extent cx="6848475" cy="38100"/>
-                <wp:effectExtent l="0" t="0" r="28575" b="19050"/>
-                <wp:wrapNone/>
-                <wp:docPr id="5" name="Straight Connector 5"/>
-                <wp:cNvGraphicFramePr/>
-                <a:graphic xmlns:a="http://schemas.openxmlformats.org/drawingml/2006/main">
-                  <a:graphicData uri="http://schemas.microsoft.com/office/word/2010/wordprocessingShape">
-                    <wps:wsp>
-                      <wps:cNvCnPr/>
-                      <wps:spPr>
-                        <a:xfrm flipV="1">
-                          <a:off x="0" y="0"/>
-                          <a:ext cx="6848475" cy="38100"/>
-                        </a:xfrm>
-                        <a:prstGeom prst="line">
-                          <a:avLst/>
-                        </a:prstGeom>
-                        <a:ln>
-                          <a:solidFill>
-                            <a:schemeClr val="tx1"/>
-                          </a:solidFill>
-                        </a:ln>
-                      </wps:spPr>
-                      <wps:style>
-                        <a:lnRef idx="1">
-                          <a:schemeClr val="dk1"/>
-                        </a:lnRef>
-                        <a:fillRef idx="0">
-                          <a:schemeClr val="dk1"/>
-                        </a:fillRef>
-                        <a:effectRef idx="0">
-                          <a:schemeClr val="dk1"/>
-                        </a:effectRef>
-                        <a:fontRef idx="minor">
-                          <a:schemeClr val="tx1"/>
-                        </a:fontRef>
-                      </wps:style>
-                      <wps:bodyPr/>
-                    </wps:wsp>
-                  </a:graphicData>
-                </a:graphic>
-              </wp:anchor>
-            </w:drawing>
-          </mc:Choice>
-          <mc:Fallback>
-            <w:pict>
-              <v:line w14:anchorId="6E8D7510" id="Straight Connector 5" o:spid="_x0000_s1026" style="position:absolute;flip:y;z-index:251667456;visibility:visible;mso-wrap-style:square;mso-wrap-distance-left:9pt;mso-wrap-distance-top:0;mso-wrap-distance-right:9pt;mso-wrap-distance-bottom:0;mso-position-horizontal:absolute;mso-position-horizontal-relative:text;mso-position-vertical:absolute;mso-position-vertical-relative:text" from="-34.5pt,6.75pt" to="504.75pt,9.75pt" o:gfxdata="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" strokecolor="black [3213]" strokeweight=".5pt">
-                <v:stroke joinstyle="miter"/>
-              </v:line>
-            </w:pict>
-          </mc:Fallback>
-        </mc:AlternateContent>
-      </w:r>
+        <w:t>Act as a seasoned Pediatrician with 20 years of experience. A parent is worried because their 3-year-old has a slight fever after a vaccination. Explain why this happens and what the 'red flags' would be that require an immediate ER visit.</w:t>
+      </w:r>
+    </w:p>
+    <w:p>
+      <w:pPr>
+        <w:pStyle w:val="NormalWeb"/>
+        <w:spacing w:before="0" w:beforeAutospacing="0" w:after="0" w:afterAutospacing="0"/>
+        <w:rPr>
+          <w:rFonts w:asciiTheme="minorHAnsi" w:hAnsiTheme="minorHAnsi" w:cstheme="minorHAnsi"/>
+        </w:rPr>
+      </w:pPr>
+    </w:p>
+    <w:p>
+      <w:pPr>
+        <w:pStyle w:val="NormalWeb"/>
+        <w:spacing w:before="0" w:beforeAutospacing="0" w:after="0" w:afterAutospacing="0"/>
+        <w:rPr>
+          <w:rFonts w:asciiTheme="minorHAnsi" w:hAnsiTheme="minorHAnsi" w:cstheme="minorHAnsi"/>
+        </w:rPr>
+      </w:pPr>
+      <w:r>
+        <w:rPr>
+          <w:rFonts w:asciiTheme="minorHAnsi" w:hAnsiTheme="minorHAnsi" w:cstheme="minorHAnsi"/>
+          <w:b/>
+        </w:rPr>
+        <w:t>Response:</w:t>
+      </w:r>
+      <w:r>
+        <w:rPr>
+          <w:rFonts w:asciiTheme="minorHAnsi" w:hAnsiTheme="minorHAnsi" w:cstheme="minorHAnsi"/>
+        </w:rPr>
+        <w:t xml:space="preserve"> </w:t>
+      </w:r>
+      <w:r>
+        <w:rPr>
+          <w:rFonts w:asciiTheme="minorHAnsi" w:hAnsiTheme="minorHAnsi" w:cstheme="minorHAnsi"/>
+          <w:u w:val="single"/>
+        </w:rPr>
+        <w:t>It is very common for toddlers to run a low-grade fever after immunizations; it's actually a sign that their immune system is working hard to build protection. However, please seek immediate emergency care if you notice 'red flags' such as difficulty breathing, a high fever that doesn't respond to medication, inconsolable crying for more than three hours, or a non-blanching rash (one that doesn't fade when pressed).</w:t>
+      </w:r>
+    </w:p>
+    <w:p>
+      <w:pPr>
+        <w:pStyle w:val="NormalWeb"/>
+        <w:spacing w:before="0" w:beforeAutospacing="0" w:after="0" w:afterAutospacing="0"/>
+      </w:pPr>
+    </w:p>
+    <w:p>
+      <w:pPr>
+        <w:pStyle w:val="NormalWeb"/>
+        <w:spacing w:before="0" w:beforeAutospacing="0" w:after="0" w:afterAutospacing="0"/>
+      </w:pPr>
+    </w:p>
+    <w:p>
+      <w:pPr>
+        <w:pStyle w:val="NormalWeb"/>
+        <w:spacing w:before="0" w:beforeAutospacing="0" w:after="0" w:afterAutospacing="0"/>
+        <w:rPr>
+          <w:rFonts w:asciiTheme="minorHAnsi" w:hAnsiTheme="minorHAnsi" w:cstheme="minorHAnsi"/>
+        </w:rPr>
+      </w:pPr>
       <w:r>
         <w:rPr>
           <w:rStyle w:val="Strong"/>
           <w:rFonts w:asciiTheme="minorHAnsi" w:hAnsiTheme="minorHAnsi" w:cstheme="minorHAnsi"/>
         </w:rPr>
+        <w:lastRenderedPageBreak/>
         <w:t xml:space="preserve">Question 6: </w:t>
       </w:r>
       <w:r>
@@ -1172,8 +1038,188 @@
         <w:rPr>
           <w:rFonts w:asciiTheme="minorHAnsi" w:hAnsiTheme="minorHAnsi" w:cstheme="minorHAnsi"/>
         </w:rPr>
-        <w:t>plan to help GreenTech compete.</w:t>
-      </w:r>
+        <w:t xml:space="preserve">plan to help </w:t>
+      </w:r>
+      <w:proofErr w:type="spellStart"/>
+      <w:r>
+        <w:rPr>
+          <w:rFonts w:asciiTheme="minorHAnsi" w:hAnsiTheme="minorHAnsi" w:cstheme="minorHAnsi"/>
+        </w:rPr>
+        <w:t>GreenTech</w:t>
+      </w:r>
+      <w:proofErr w:type="spellEnd"/>
+      <w:r>
+        <w:rPr>
+          <w:rFonts w:asciiTheme="minorHAnsi" w:hAnsiTheme="minorHAnsi" w:cstheme="minorHAnsi"/>
+        </w:rPr>
+        <w:t xml:space="preserve"> compete.</w:t>
+      </w:r>
+    </w:p>
+    <w:p>
+      <w:pPr>
+        <w:pStyle w:val="NormalWeb"/>
+        <w:rPr>
+          <w:rFonts w:ascii="Calibri" w:hAnsi="Calibri" w:cs="Calibri"/>
+          <w:b/>
+        </w:rPr>
+      </w:pPr>
+      <w:r>
+        <w:rPr>
+          <w:rFonts w:ascii="Calibri" w:hAnsi="Calibri" w:cs="Calibri"/>
+          <w:b/>
+        </w:rPr>
+        <w:t xml:space="preserve">Response: </w:t>
+      </w:r>
+    </w:p>
+    <w:p>
+      <w:pPr>
+        <w:pStyle w:val="NormalWeb"/>
+        <w:numPr>
+          <w:ilvl w:val="0"/>
+          <w:numId w:val="4"/>
+        </w:numPr>
+        <w:rPr>
+          <w:rFonts w:ascii="Calibri" w:hAnsi="Calibri" w:cs="Calibri"/>
+          <w:u w:val="single"/>
+        </w:rPr>
+      </w:pPr>
+      <w:r>
+        <w:rPr>
+          <w:rFonts w:ascii="Calibri" w:hAnsi="Calibri" w:cs="Calibri"/>
+          <w:b/>
+          <w:bCs/>
+        </w:rPr>
+        <w:t>Highlight Durability:</w:t>
+      </w:r>
+      <w:r>
+        <w:rPr>
+          <w:rFonts w:ascii="Calibri" w:hAnsi="Calibri" w:cs="Calibri"/>
+        </w:rPr>
+        <w:t xml:space="preserve"> </w:t>
+      </w:r>
+      <w:r>
+        <w:rPr>
+          <w:rFonts w:ascii="Calibri" w:hAnsi="Calibri" w:cs="Calibri"/>
+          <w:u w:val="single"/>
+        </w:rPr>
+        <w:t>Launch a social media campaign emphasizing that while the case costs more, it lasts longer than cheaper alternatives, saving money over time.</w:t>
+      </w:r>
+    </w:p>
+    <w:p>
+      <w:pPr>
+        <w:pStyle w:val="NormalWeb"/>
+        <w:ind w:left="720"/>
+        <w:rPr>
+          <w:rFonts w:ascii="Calibri" w:hAnsi="Calibri" w:cs="Calibri"/>
+          <w:u w:val="single"/>
+        </w:rPr>
+      </w:pPr>
+    </w:p>
+    <w:p>
+      <w:pPr>
+        <w:pStyle w:val="ListParagraph"/>
+        <w:numPr>
+          <w:ilvl w:val="0"/>
+          <w:numId w:val="4"/>
+        </w:numPr>
+        <w:spacing w:before="100" w:beforeAutospacing="1" w:after="100" w:afterAutospacing="1" w:line="240" w:lineRule="auto"/>
+        <w:rPr>
+          <w:rFonts w:ascii="Calibri" w:eastAsia="Times New Roman" w:hAnsi="Calibri" w:cs="Calibri"/>
+          <w:sz w:val="24"/>
+          <w:szCs w:val="24"/>
+          <w:u w:val="single"/>
+        </w:rPr>
+      </w:pPr>
+      <w:r>
+        <w:rPr>
+          <w:rFonts w:ascii="Calibri" w:eastAsia="Times New Roman" w:hAnsi="Calibri" w:cs="Calibri"/>
+          <w:b/>
+          <w:bCs/>
+          <w:sz w:val="24"/>
+          <w:szCs w:val="24"/>
+        </w:rPr>
+        <w:t>Leverage Color Variety:</w:t>
+      </w:r>
+      <w:r>
+        <w:rPr>
+          <w:rFonts w:ascii="Calibri" w:eastAsia="Times New Roman" w:hAnsi="Calibri" w:cs="Calibri"/>
+          <w:sz w:val="24"/>
+          <w:szCs w:val="24"/>
+        </w:rPr>
+        <w:t xml:space="preserve"> </w:t>
+      </w:r>
+      <w:r>
+        <w:rPr>
+          <w:rFonts w:ascii="Calibri" w:eastAsia="Times New Roman" w:hAnsi="Calibri" w:cs="Calibri"/>
+          <w:sz w:val="24"/>
+          <w:szCs w:val="24"/>
+          <w:u w:val="single"/>
+        </w:rPr>
+        <w:t>Use the $5,000 budget to run targeted ads showcasing the 10 different color options, positioning the product as a fashion statement compared to the competitor's limited choices.</w:t>
+      </w:r>
+    </w:p>
+    <w:p>
+      <w:pPr>
+        <w:spacing w:before="100" w:beforeAutospacing="1" w:after="100" w:afterAutospacing="1" w:line="240" w:lineRule="auto"/>
+        <w:ind w:left="360"/>
+        <w:rPr>
+          <w:rFonts w:ascii="Calibri" w:eastAsia="Times New Roman" w:hAnsi="Calibri" w:cs="Calibri"/>
+          <w:sz w:val="2"/>
+          <w:szCs w:val="24"/>
+          <w:u w:val="single"/>
+        </w:rPr>
+      </w:pPr>
+    </w:p>
+    <w:p>
+      <w:pPr>
+        <w:pStyle w:val="ListParagraph"/>
+        <w:numPr>
+          <w:ilvl w:val="0"/>
+          <w:numId w:val="4"/>
+        </w:numPr>
+        <w:spacing w:before="100" w:beforeAutospacing="1" w:after="100" w:afterAutospacing="1" w:line="240" w:lineRule="auto"/>
+        <w:rPr>
+          <w:rFonts w:ascii="Calibri" w:eastAsia="Times New Roman" w:hAnsi="Calibri" w:cs="Calibri"/>
+          <w:sz w:val="24"/>
+          <w:szCs w:val="24"/>
+          <w:u w:val="single"/>
+        </w:rPr>
+      </w:pPr>
+      <w:r>
+        <w:rPr>
+          <w:rFonts w:ascii="Calibri" w:eastAsia="Times New Roman" w:hAnsi="Calibri" w:cs="Calibri"/>
+          <w:b/>
+          <w:bCs/>
+          <w:sz w:val="24"/>
+          <w:szCs w:val="24"/>
+        </w:rPr>
+        <w:t>Emphasize Material Origin:</w:t>
+      </w:r>
+      <w:r>
+        <w:rPr>
+          <w:rFonts w:ascii="Calibri" w:eastAsia="Times New Roman" w:hAnsi="Calibri" w:cs="Calibri"/>
+          <w:sz w:val="24"/>
+          <w:szCs w:val="24"/>
+        </w:rPr>
+        <w:t xml:space="preserve"> </w:t>
+      </w:r>
+      <w:r>
+        <w:rPr>
+          <w:rFonts w:ascii="Calibri" w:eastAsia="Times New Roman" w:hAnsi="Calibri" w:cs="Calibri"/>
+          <w:sz w:val="24"/>
+          <w:szCs w:val="24"/>
+          <w:u w:val="single"/>
+        </w:rPr>
+        <w:t>Focus messaging on the 'Hemp' construction to appeal to eco-conscious consumers who prioritize truly organic materials over generic 'plastic-free' claims.</w:t>
+      </w:r>
+    </w:p>
+    <w:p>
+      <w:pPr>
+        <w:pStyle w:val="NormalWeb"/>
+        <w:rPr>
+          <w:rFonts w:asciiTheme="minorHAnsi" w:hAnsiTheme="minorHAnsi" w:cstheme="minorHAnsi"/>
+        </w:rPr>
+      </w:pPr>
     </w:p>
     <w:p>
       <w:pPr>
@@ -1199,6 +1245,232 @@
 <file path=word/numbering.xml><?xml version="1.0" encoding="utf-8"?>
 <w:numbering xmlns:wpc="http://schemas.microsoft.com/office/word/2010/wordprocessingCanvas" xmlns:mc="http://schemas.openxmlformats.org/markup-compatibility/2006" xmlns:o="urn:schemas-microsoft-com:office:office" xmlns:r="http://schemas.openxmlformats.org/officeDocument/2006/relationships" xmlns:m="http://schemas.openxmlformats.org/officeDocument/2006/math" xmlns:v="urn:schemas-microsoft-com:vml" xmlns:wp14="http://schemas.microsoft.com/office/word/2010/wordprocessingDrawing" xmlns:wp="http://schemas.openxmlformats.org/drawingml/2006/wordprocessingDrawing" xmlns:w10="urn:schemas-microsoft-com:office:word" xmlns:w="http://schemas.openxmlformats.org/wordprocessingml/2006/main" xmlns:w14="http://schemas.microsoft.com/office/word/2010/wordml" xmlns:w15="http://schemas.microsoft.com/office/word/2012/wordml" xmlns:wpg="http://schemas.microsoft.com/office/word/2010/wordprocessingGroup" xmlns:wpi="http://schemas.microsoft.com/office/word/2010/wordprocessingInk" xmlns:wne="http://schemas.microsoft.com/office/word/2006/wordml" xmlns:wps="http://schemas.microsoft.com/office/word/2010/wordprocessingShape" mc:Ignorable="w14 w15 wp14">
   <w:abstractNum w:abstractNumId="0" w15:restartNumberingAfterBreak="0">
+    <w:nsid w:val="1B8F6B25"/>
+    <w:multiLevelType w:val="hybridMultilevel"/>
+    <w:tmpl w:val="A446B460"/>
+    <w:lvl w:ilvl="0" w:tplc="0409000B">
+      <w:start w:val="1"/>
+      <w:numFmt w:val="bullet"/>
+      <w:lvlText w:val=""/>
+      <w:lvlJc w:val="left"/>
+      <w:pPr>
+        <w:ind w:left="720" w:hanging="360"/>
+      </w:pPr>
+      <w:rPr>
+        <w:rFonts w:ascii="Wingdings" w:hAnsi="Wingdings" w:hint="default"/>
+      </w:rPr>
+    </w:lvl>
+    <w:lvl w:ilvl="1" w:tplc="04090003" w:tentative="1">
+      <w:start w:val="1"/>
+      <w:numFmt w:val="bullet"/>
+      <w:lvlText w:val="o"/>
+      <w:lvlJc w:val="left"/>
+      <w:pPr>
+        <w:ind w:left="1440" w:hanging="360"/>
+      </w:pPr>
+      <w:rPr>
+        <w:rFonts w:ascii="Courier New" w:hAnsi="Courier New" w:cs="Courier New" w:hint="default"/>
+      </w:rPr>
+    </w:lvl>
+    <w:lvl w:ilvl="2" w:tplc="04090005" w:tentative="1">
+      <w:start w:val="1"/>
+      <w:numFmt w:val="bullet"/>
+      <w:lvlText w:val=""/>
+      <w:lvlJc w:val="left"/>
+      <w:pPr>
+        <w:ind w:left="2160" w:hanging="360"/>
+      </w:pPr>
+      <w:rPr>
+        <w:rFonts w:ascii="Wingdings" w:hAnsi="Wingdings" w:hint="default"/>
+      </w:rPr>
+    </w:lvl>
+    <w:lvl w:ilvl="3" w:tplc="04090001" w:tentative="1">
+      <w:start w:val="1"/>
+      <w:numFmt w:val="bullet"/>
+      <w:lvlText w:val=""/>
+      <w:lvlJc w:val="left"/>
+      <w:pPr>
+        <w:ind w:left="2880" w:hanging="360"/>
+      </w:pPr>
+      <w:rPr>
+        <w:rFonts w:ascii="Symbol" w:hAnsi="Symbol" w:hint="default"/>
+      </w:rPr>
+    </w:lvl>
+    <w:lvl w:ilvl="4" w:tplc="04090003" w:tentative="1">
+      <w:start w:val="1"/>
+      <w:numFmt w:val="bullet"/>
+      <w:lvlText w:val="o"/>
+      <w:lvlJc w:val="left"/>
+      <w:pPr>
+        <w:ind w:left="3600" w:hanging="360"/>
+      </w:pPr>
+      <w:rPr>
+        <w:rFonts w:ascii="Courier New" w:hAnsi="Courier New" w:cs="Courier New" w:hint="default"/>
+      </w:rPr>
+    </w:lvl>
+    <w:lvl w:ilvl="5" w:tplc="04090005" w:tentative="1">
+      <w:start w:val="1"/>
+      <w:numFmt w:val="bullet"/>
+      <w:lvlText w:val=""/>
+      <w:lvlJc w:val="left"/>
+      <w:pPr>
+        <w:ind w:left="4320" w:hanging="360"/>
+      </w:pPr>
+      <w:rPr>
+        <w:rFonts w:ascii="Wingdings" w:hAnsi="Wingdings" w:hint="default"/>
+      </w:rPr>
+    </w:lvl>
+    <w:lvl w:ilvl="6" w:tplc="04090001" w:tentative="1">
+      <w:start w:val="1"/>
+      <w:numFmt w:val="bullet"/>
+      <w:lvlText w:val=""/>
+      <w:lvlJc w:val="left"/>
+      <w:pPr>
+        <w:ind w:left="5040" w:hanging="360"/>
+      </w:pPr>
+      <w:rPr>
+        <w:rFonts w:ascii="Symbol" w:hAnsi="Symbol" w:hint="default"/>
+      </w:rPr>
+    </w:lvl>
+    <w:lvl w:ilvl="7" w:tplc="04090003" w:tentative="1">
+      <w:start w:val="1"/>
+      <w:numFmt w:val="bullet"/>
+      <w:lvlText w:val="o"/>
+      <w:lvlJc w:val="left"/>
+      <w:pPr>
+        <w:ind w:left="5760" w:hanging="360"/>
+      </w:pPr>
+      <w:rPr>
+        <w:rFonts w:ascii="Courier New" w:hAnsi="Courier New" w:cs="Courier New" w:hint="default"/>
+      </w:rPr>
+    </w:lvl>
+    <w:lvl w:ilvl="8" w:tplc="04090005" w:tentative="1">
+      <w:start w:val="1"/>
+      <w:numFmt w:val="bullet"/>
+      <w:lvlText w:val=""/>
+      <w:lvlJc w:val="left"/>
+      <w:pPr>
+        <w:ind w:left="6480" w:hanging="360"/>
+      </w:pPr>
+      <w:rPr>
+        <w:rFonts w:ascii="Wingdings" w:hAnsi="Wingdings" w:hint="default"/>
+      </w:rPr>
+    </w:lvl>
+  </w:abstractNum>
+  <w:abstractNum w:abstractNumId="1" w15:restartNumberingAfterBreak="0">
+    <w:nsid w:val="37D23505"/>
+    <w:multiLevelType w:val="hybridMultilevel"/>
+    <w:tmpl w:val="98B84DB2"/>
+    <w:lvl w:ilvl="0" w:tplc="0409000B">
+      <w:start w:val="1"/>
+      <w:numFmt w:val="bullet"/>
+      <w:lvlText w:val=""/>
+      <w:lvlJc w:val="left"/>
+      <w:pPr>
+        <w:ind w:left="825" w:hanging="360"/>
+      </w:pPr>
+      <w:rPr>
+        <w:rFonts w:ascii="Wingdings" w:hAnsi="Wingdings" w:hint="default"/>
+      </w:rPr>
+    </w:lvl>
+    <w:lvl w:ilvl="1" w:tplc="04090003" w:tentative="1">
+      <w:start w:val="1"/>
+      <w:numFmt w:val="bullet"/>
+      <w:lvlText w:val="o"/>
+      <w:lvlJc w:val="left"/>
+      <w:pPr>
+        <w:ind w:left="1545" w:hanging="360"/>
+      </w:pPr>
+      <w:rPr>
+        <w:rFonts w:ascii="Courier New" w:hAnsi="Courier New" w:cs="Courier New" w:hint="default"/>
+      </w:rPr>
+    </w:lvl>
+    <w:lvl w:ilvl="2" w:tplc="04090005" w:tentative="1">
+      <w:start w:val="1"/>
+      <w:numFmt w:val="bullet"/>
+      <w:lvlText w:val=""/>
+      <w:lvlJc w:val="left"/>
+      <w:pPr>
+        <w:ind w:left="2265" w:hanging="360"/>
+      </w:pPr>
+      <w:rPr>
+        <w:rFonts w:ascii="Wingdings" w:hAnsi="Wingdings" w:hint="default"/>
+      </w:rPr>
+    </w:lvl>
+    <w:lvl w:ilvl="3" w:tplc="04090001" w:tentative="1">
+      <w:start w:val="1"/>
+      <w:numFmt w:val="bullet"/>
+      <w:lvlText w:val=""/>
+      <w:lvlJc w:val="left"/>
+      <w:pPr>
+        <w:ind w:left="2985" w:hanging="360"/>
+      </w:pPr>
+      <w:rPr>
+        <w:rFonts w:ascii="Symbol" w:hAnsi="Symbol" w:hint="default"/>
+      </w:rPr>
+    </w:lvl>
+    <w:lvl w:ilvl="4" w:tplc="04090003" w:tentative="1">
+      <w:start w:val="1"/>
+      <w:numFmt w:val="bullet"/>
+      <w:lvlText w:val="o"/>
+      <w:lvlJc w:val="left"/>
+      <w:pPr>
+        <w:ind w:left="3705" w:hanging="360"/>
+      </w:pPr>
+      <w:rPr>
+        <w:rFonts w:ascii="Courier New" w:hAnsi="Courier New" w:cs="Courier New" w:hint="default"/>
+      </w:rPr>
+    </w:lvl>
+    <w:lvl w:ilvl="5" w:tplc="04090005" w:tentative="1">
+      <w:start w:val="1"/>
+      <w:numFmt w:val="bullet"/>
+      <w:lvlText w:val=""/>
+      <w:lvlJc w:val="left"/>
+      <w:pPr>
+        <w:ind w:left="4425" w:hanging="360"/>
+      </w:pPr>
+      <w:rPr>
+        <w:rFonts w:ascii="Wingdings" w:hAnsi="Wingdings" w:hint="default"/>
+      </w:rPr>
+    </w:lvl>
+    <w:lvl w:ilvl="6" w:tplc="04090001" w:tentative="1">
+      <w:start w:val="1"/>
+      <w:numFmt w:val="bullet"/>
+      <w:lvlText w:val=""/>
+      <w:lvlJc w:val="left"/>
+      <w:pPr>
+        <w:ind w:left="5145" w:hanging="360"/>
+      </w:pPr>
+      <w:rPr>
+        <w:rFonts w:ascii="Symbol" w:hAnsi="Symbol" w:hint="default"/>
+      </w:rPr>
+    </w:lvl>
+    <w:lvl w:ilvl="7" w:tplc="04090003" w:tentative="1">
+      <w:start w:val="1"/>
+      <w:numFmt w:val="bullet"/>
+      <w:lvlText w:val="o"/>
+      <w:lvlJc w:val="left"/>
+      <w:pPr>
+        <w:ind w:left="5865" w:hanging="360"/>
+      </w:pPr>
+      <w:rPr>
+        <w:rFonts w:ascii="Courier New" w:hAnsi="Courier New" w:cs="Courier New" w:hint="default"/>
+      </w:rPr>
+    </w:lvl>
+    <w:lvl w:ilvl="8" w:tplc="04090005" w:tentative="1">
+      <w:start w:val="1"/>
+      <w:numFmt w:val="bullet"/>
+      <w:lvlText w:val=""/>
+      <w:lvlJc w:val="left"/>
+      <w:pPr>
+        <w:ind w:left="6585" w:hanging="360"/>
+      </w:pPr>
+      <w:rPr>
+        <w:rFonts w:ascii="Wingdings" w:hAnsi="Wingdings" w:hint="default"/>
+      </w:rPr>
+    </w:lvl>
+  </w:abstractNum>
+  <w:abstractNum w:abstractNumId="2" w15:restartNumberingAfterBreak="0">
     <w:nsid w:val="50D303C6"/>
     <w:multiLevelType w:val="multilevel"/>
     <w:tmpl w:val="E09ECB0A"/>
@@ -1311,7 +1583,7 @@
       </w:pPr>
     </w:lvl>
   </w:abstractNum>
-  <w:abstractNum w:abstractNumId="1" w15:restartNumberingAfterBreak="0">
+  <w:abstractNum w:abstractNumId="3" w15:restartNumberingAfterBreak="0">
     <w:nsid w:val="60AF5CF2"/>
     <w:multiLevelType w:val="multilevel"/>
     <w:tmpl w:val="10A62038"/>
@@ -1425,10 +1697,16 @@
     </w:lvl>
   </w:abstractNum>
   <w:num w:numId="1">
-    <w:abstractNumId w:val="0"/>
+    <w:abstractNumId w:val="2"/>
   </w:num>
   <w:num w:numId="2">
+    <w:abstractNumId w:val="3"/>
+  </w:num>
+  <w:num w:numId="3">
     <w:abstractNumId w:val="1"/>
+  </w:num>
+  <w:num w:numId="4">
+    <w:abstractNumId w:val="0"/>
   </w:num>
 </w:numbering>
 </file>
@@ -1913,6 +2191,17 @@
       <w:szCs w:val="24"/>
     </w:rPr>
   </w:style>
+  <w:style w:type="paragraph" w:styleId="ListParagraph">
+    <w:name w:val="List Paragraph"/>
+    <w:basedOn w:val="Normal"/>
+    <w:uiPriority w:val="34"/>
+    <w:qFormat/>
+    <w:rsid w:val="00DF0196"/>
+    <w:pPr>
+      <w:ind w:left="720"/>
+      <w:contextualSpacing/>
+    </w:pPr>
+  </w:style>
 </w:styles>
 </file>
 

</xml_diff>